<commit_message>
checkpoint: land 2026-09-28 in-flight features and docs
</commit_message>
<xml_diff>
--- a/docs/SLD-水果市场销售分析-功能说明书.docx
+++ b/docs/SLD-水果市场销售分析-功能说明书.docx
@@ -478,7 +478,7 @@
         <w:pStyle w:val="ListBullet"/>
       </w:pPr>
       <w:r>
-        <w:t>销售看板：按销售日期和商号查看总销量、总销售额、每件均价及 A/B/C 等级结构与规格图表。</w:t>
+        <w:t>销售看板：按销售日期、国家和市场查看总柜数、总销售额、每件均价及等级结构与规格图表，并统计各品牌柜数。</w:t>
       </w:r>
     </w:p>
     <w:p>
@@ -1248,7 +1248,7 @@
     <w:p>
       <w:pPr/>
       <w:r>
-        <w:t>查看筛选范围内所有结算单的总体销量、销售额、每件均价，以及 A/B/C 三级的销售情况。</w:t>
+        <w:t>查看筛选范围内所有结算单的总体销量与销售额；各等级销售情况在「等级销售分析」区块查看（等级项不含 AB 与「其他」）。</w:t>
       </w:r>
     </w:p>
     <w:p>
@@ -1272,7 +1272,9 @@
         <w:pStyle w:val="ListBullet"/>
       </w:pPr>
       <w:r>
-        <w:t>商号下拉：切换后立即刷新；默认「全部结算单」。</w:t>
+        <w:t>国家下拉：切换后立即刷新；默认「全部国家」。</w:t>
+        <w:br/>
+        <w:t>市场下拉：切换后立即刷新；默认「全部市场」。</w:t>
       </w:r>
     </w:p>
     <w:p>
@@ -1304,7 +1306,7 @@
         <w:pStyle w:val="ListBullet"/>
       </w:pPr>
       <w:r>
-        <w:t>总销量：筛选范围内销量之和。</w:t>
+        <w:t>总柜数：筛选范围内销量之和（按全部数据计算，不因隐藏等级而剔除）。</w:t>
       </w:r>
     </w:p>
     <w:p>
@@ -1328,7 +1330,7 @@
         <w:pStyle w:val="ListBullet"/>
       </w:pPr>
       <w:r>
-        <w:t>A/B/C 卡片：分别展示销量、销售额、每件均价和数量占比。</w:t>
+        <w:t>「销售情况」区块只展示总柜数与销售金额汇总条；等级卡片已移除，各等级情况见「等级销售分析」。</w:t>
       </w:r>
     </w:p>
     <w:p>
@@ -1336,7 +1338,7 @@
         <w:pStyle w:val="Heading2"/>
       </w:pPr>
       <w:r>
-        <w:t>6.4 等级图表</w:t>
+        <w:t>6.4 等级销售分析</w:t>
       </w:r>
     </w:p>
     <w:p>
@@ -1344,7 +1346,7 @@
         <w:pStyle w:val="ListBullet"/>
       </w:pPr>
       <w:r>
-        <w:t>展示等级件数结构、各等级每件均价和各等级各规格件数/均价。</w:t>
+        <w:t>区块展示等级件数结构（饼图）、规格件数与均价（横向柱图表格）和销售柜数统计。</w:t>
       </w:r>
     </w:p>
     <w:p>
@@ -1352,7 +1354,11 @@
         <w:pStyle w:val="ListBullet"/>
       </w:pPr>
       <w:r>
-        <w:t>全部结算单与单商号共用同一等级图表接口，商号切换后图表同步刷新。</w:t>
+        <w:t>规格表列依次为：等级、规格、备注、每件均价、总件数、件数分布、占比；备注在同一「等级+规格」组的销售行备注完全一致时展示，不一致时显示「多个」（悬浮查看全部）。</w:t>
+        <w:br/>
+        <w:t>销售柜数统计：饼图展示各品牌柜数占比，柱图展示各品牌柜数对比，柱体顶部标注具体数量与单位（如「14 柜」）；柜数按品牌统计结算单（商号）数量。</w:t>
+        <w:br/>
+        <w:t>等级项同样不展示 AB 与「其他」。</w:t>
       </w:r>
     </w:p>
     <w:p>

</xml_diff>